<commit_message>
semana 12 de clases
</commit_message>
<xml_diff>
--- a/SEMANA 2/Apuntes POO Clase 2.docx
+++ b/SEMANA 2/Apuntes POO Clase 2.docx
@@ -64,6 +64,12 @@
           <w:lang w:val="es-EC"/>
         </w:rPr>
         <w:t>Uso setters como puente que me permite asignar valores a los atributos de un objeto</w:t>
+      </w:r>
+      <w:r>
+        <w:rPr>
+          <w:lang w:val="es-EC"/>
+        </w:rPr>
+        <w:t>.</w:t>
       </w:r>
     </w:p>
     <w:sectPr>

</xml_diff>